<commit_message>
docs(y2/sem1/life-safety/lab): revise conscious consumption report
</commit_message>
<xml_diff>
--- a/year-2/semester-1/life-safety/labworks/conscious-consumption/labwork2-505013.docx
+++ b/year-2/semester-1/life-safety/labworks/conscious-consumption/labwork2-505013.docx
@@ -1,6 +1,6 @@
 
 <file path=word/document.xml><?xml version="1.0" encoding="utf-8"?>
-<w:document xmlns:wpc="http://schemas.microsoft.com/office/word/2010/wordprocessingCanvas" xmlns:cx="http://schemas.microsoft.com/office/drawing/2014/chartex" xmlns:cx1="http://schemas.microsoft.com/office/drawing/2015/9/8/chartex" xmlns:cx2="http://schemas.microsoft.com/office/drawing/2015/10/21/chartex" xmlns:cx3="http://schemas.microsoft.com/office/drawing/2016/5/9/chartex" xmlns:cx4="http://schemas.microsoft.com/office/drawing/2016/5/10/chartex" xmlns:cx5="http://schemas.microsoft.com/office/drawing/2016/5/11/chartex" xmlns:cx6="http://schemas.microsoft.com/office/drawing/2016/5/12/chartex" xmlns:cx7="http://schemas.microsoft.com/office/drawing/2016/5/13/chartex" xmlns:cx8="http://schemas.microsoft.com/office/drawing/2016/5/14/chartex" xmlns:mc="http://schemas.openxmlformats.org/markup-compatibility/2006" xmlns:aink="http://schemas.microsoft.com/office/drawing/2016/ink" xmlns:am3d="http://schemas.microsoft.com/office/drawing/2017/model3d" xmlns:o="urn:schemas-microsoft-com:office:office" xmlns:oel="http://schemas.microsoft.com/office/2019/extlst" xmlns:r="http://schemas.openxmlformats.org/officeDocument/2006/relationships" xmlns:m="http://schemas.openxmlformats.org/officeDocument/2006/math" xmlns:v="urn:schemas-microsoft-com:vml" xmlns:wp14="http://schemas.microsoft.com/office/word/2010/wordprocessingDrawing" xmlns:wp="http://schemas.openxmlformats.org/drawingml/2006/wordprocessingDrawing" xmlns:w10="urn:schemas-microsoft-com:office:word" xmlns:w="http://schemas.openxmlformats.org/wordprocessingml/2006/main" xmlns:w14="http://schemas.microsoft.com/office/word/2010/wordml" xmlns:w15="http://schemas.microsoft.com/office/word/2012/wordml" xmlns:w16cex="http://schemas.microsoft.com/office/word/2018/wordml/cex" xmlns:w16cid="http://schemas.microsoft.com/office/word/2016/wordml/cid" xmlns:w16="http://schemas.microsoft.com/office/word/2018/wordml" xmlns:w16du="http://schemas.microsoft.com/office/word/2023/wordml/word16du" xmlns:w16sdtdh="http://schemas.microsoft.com/office/word/2020/wordml/sdtdatahash" xmlns:w16sdtfl="http://schemas.microsoft.com/office/word/2024/wordml/sdtformatlock" xmlns:w16se="http://schemas.microsoft.com/office/word/2015/wordml/symex" xmlns:wpg="http://schemas.microsoft.com/office/word/2010/wordprocessingGroup" xmlns:wpi="http://schemas.microsoft.com/office/word/2010/wordprocessingInk" xmlns:wne="http://schemas.microsoft.com/office/word/2006/wordml" xmlns:wps="http://schemas.microsoft.com/office/word/2010/wordprocessingShape" mc:Ignorable="w14 w15 w16se w16cid w16 w16cex w16sdtdh w16sdtfl w16du wp14">
+<w:document xmlns:wpc="http://schemas.microsoft.com/office/word/2010/wordprocessingCanvas" xmlns:mc="http://schemas.openxmlformats.org/markup-compatibility/2006" xmlns:o="urn:schemas-microsoft-com:office:office" xmlns:r="http://schemas.openxmlformats.org/officeDocument/2006/relationships" xmlns:m="http://schemas.openxmlformats.org/officeDocument/2006/math" xmlns:v="urn:schemas-microsoft-com:vml" xmlns:wp14="http://schemas.microsoft.com/office/word/2010/wordprocessingDrawing" xmlns:wp="http://schemas.openxmlformats.org/drawingml/2006/wordprocessingDrawing" xmlns:w10="urn:schemas-microsoft-com:office:word" xmlns:w="http://schemas.openxmlformats.org/wordprocessingml/2006/main" xmlns:w14="http://schemas.microsoft.com/office/word/2010/wordml" xmlns:w15="http://schemas.microsoft.com/office/word/2012/wordml" xmlns:wpg="http://schemas.microsoft.com/office/word/2010/wordprocessingGroup" xmlns:wpi="http://schemas.microsoft.com/office/word/2010/wordprocessingInk" xmlns:wne="http://schemas.microsoft.com/office/word/2006/wordml" xmlns:wps="http://schemas.microsoft.com/office/word/2010/wordprocessingShape" mc:Ignorable="w14 w15 wp14">
   <w:body>
     <w:p>
       <w:pPr>
@@ -15,84 +15,18 @@
         <w:rPr>
           <w:noProof/>
         </w:rPr>
-        <w:drawing>
-          <wp:anchor distT="0" distB="0" distL="114300" distR="114300" simplePos="0" relativeHeight="251660288" behindDoc="1" locked="0" layoutInCell="1" allowOverlap="1" wp14:anchorId="1A91CC75" wp14:editId="1A745DBB">
-            <wp:simplePos x="0" y="0"/>
-            <wp:positionH relativeFrom="column">
-              <wp:posOffset>-1080135</wp:posOffset>
-            </wp:positionH>
-            <wp:positionV relativeFrom="paragraph">
-              <wp:posOffset>-781082</wp:posOffset>
-            </wp:positionV>
-            <wp:extent cx="7602220" cy="10751295"/>
-            <wp:effectExtent l="0" t="0" r="0" b="0"/>
-            <wp:wrapNone/>
-            <wp:docPr id="856715392" name="Рисунок 15"/>
-            <wp:cNvGraphicFramePr>
-              <a:graphicFrameLocks xmlns:a="http://schemas.openxmlformats.org/drawingml/2006/main" noChangeAspect="1"/>
-            </wp:cNvGraphicFramePr>
-            <a:graphic xmlns:a="http://schemas.openxmlformats.org/drawingml/2006/main">
-              <a:graphicData uri="http://schemas.openxmlformats.org/drawingml/2006/picture">
-                <pic:pic xmlns:pic="http://schemas.openxmlformats.org/drawingml/2006/picture">
-                  <pic:nvPicPr>
-                    <pic:cNvPr id="856715392" name="Рисунок 15"/>
-                    <pic:cNvPicPr>
-                      <a:picLocks noChangeAspect="1" noChangeArrowheads="1"/>
-                    </pic:cNvPicPr>
-                  </pic:nvPicPr>
-                  <pic:blipFill>
-                    <a:blip r:embed="rId6" cstate="print">
-                      <a:extLst>
-                        <a:ext uri="{28A0092B-C50C-407E-A947-70E740481C1C}">
-                          <a14:useLocalDpi xmlns:a14="http://schemas.microsoft.com/office/drawing/2010/main" val="0"/>
-                        </a:ext>
-                      </a:extLst>
-                    </a:blip>
-                    <a:stretch>
-                      <a:fillRect/>
-                    </a:stretch>
-                  </pic:blipFill>
-                  <pic:spPr bwMode="auto">
-                    <a:xfrm>
-                      <a:off x="0" y="0"/>
-                      <a:ext cx="7602220" cy="10751295"/>
-                    </a:xfrm>
-                    <a:prstGeom prst="rect">
-                      <a:avLst/>
-                    </a:prstGeom>
-                    <a:noFill/>
-                    <a:ln>
-                      <a:noFill/>
-                    </a:ln>
-                  </pic:spPr>
-                </pic:pic>
-              </a:graphicData>
-            </a:graphic>
-            <wp14:sizeRelH relativeFrom="margin">
-              <wp14:pctWidth>0</wp14:pctWidth>
-            </wp14:sizeRelH>
-            <wp14:sizeRelV relativeFrom="margin">
-              <wp14:pctHeight>0</wp14:pctHeight>
-            </wp14:sizeRelV>
-          </wp:anchor>
-        </w:drawing>
-      </w:r>
-      <w:r>
-        <w:rPr>
-          <w:noProof/>
-        </w:rPr>
         <mc:AlternateContent>
           <mc:Choice Requires="wps">
             <w:drawing>
-              <wp:anchor distT="0" distB="0" distL="114300" distR="114300" simplePos="0" relativeHeight="251659264" behindDoc="0" locked="0" layoutInCell="1" allowOverlap="1" wp14:anchorId="6F507AC4" wp14:editId="64A60F6C">
+              <wp:anchor distT="0" distB="0" distL="114300" distR="114300" simplePos="0" relativeHeight="251659264" behindDoc="0" locked="0" layoutInCell="1" allowOverlap="1" wp14:anchorId="6F507AC4" wp14:editId="6F1CF6B3">
                 <wp:simplePos x="0" y="0"/>
                 <wp:positionH relativeFrom="column">
-                  <wp:posOffset>1878330</wp:posOffset>
+                  <wp:posOffset>1878602</wp:posOffset>
                 </wp:positionH>
                 <wp:positionV relativeFrom="paragraph">
-                  <wp:posOffset>6006374</wp:posOffset>
+                  <wp:posOffset>6007281</wp:posOffset>
                 </wp:positionV>
-                <wp:extent cx="4564256" cy="1514902"/>
+                <wp:extent cx="4563745" cy="1685109"/>
                 <wp:effectExtent l="0" t="0" r="0" b="0"/>
                 <wp:wrapNone/>
                 <wp:docPr id="1930059487" name="Надпись 4"/>
@@ -104,7 +38,7 @@
                       <wps:spPr>
                         <a:xfrm>
                           <a:off x="0" y="0"/>
-                          <a:ext cx="4564256" cy="1514902"/>
+                          <a:ext cx="4563745" cy="1685109"/>
                         </a:xfrm>
                         <a:prstGeom prst="rect">
                           <a:avLst/>
@@ -142,7 +76,15 @@
                                 <w:sz w:val="26"/>
                                 <w:szCs w:val="26"/>
                               </w:rPr>
-                              <w:t xml:space="preserve"> Иванов Иван Иванович</w:t>
+                              <w:t xml:space="preserve"> Иванов </w:t>
+                            </w:r>
+                            <w:r>
+                              <w:rPr>
+                                <w:rFonts w:ascii="Muller Regular" w:hAnsi="Muller Regular"/>
+                                <w:sz w:val="26"/>
+                                <w:szCs w:val="26"/>
+                              </w:rPr>
+                              <w:t>Андрей Вячеславович</w:t>
                             </w:r>
                           </w:p>
                           <w:p>
@@ -171,8 +113,18 @@
                                 <w:sz w:val="26"/>
                                 <w:szCs w:val="26"/>
                               </w:rPr>
-                              <w:t xml:space="preserve"> ПИиКТ</w:t>
+                              <w:t xml:space="preserve"> </w:t>
                             </w:r>
+                            <w:proofErr w:type="spellStart"/>
+                            <w:r>
+                              <w:rPr>
+                                <w:rFonts w:ascii="Muller Regular" w:hAnsi="Muller Regular"/>
+                                <w:sz w:val="26"/>
+                                <w:szCs w:val="26"/>
+                              </w:rPr>
+                              <w:t>ФИТиП</w:t>
+                            </w:r>
+                            <w:proofErr w:type="spellEnd"/>
                           </w:p>
                           <w:p>
                             <w:pPr>
@@ -208,7 +160,7 @@
                                 <w:sz w:val="26"/>
                                 <w:szCs w:val="26"/>
                               </w:rPr>
-                              <w:t>P32202</w:t>
+                              <w:t>М3204</w:t>
                             </w:r>
                           </w:p>
                           <w:p>
@@ -274,7 +226,7 @@
                 <v:stroke joinstyle="miter"/>
                 <v:path gradientshapeok="t" o:connecttype="rect"/>
               </v:shapetype>
-              <v:shape id="Надпись 4" o:spid="_x0000_s1026" type="#_x0000_t202" style="position:absolute;margin-left:147.9pt;margin-top:472.95pt;width:359.4pt;height:119.3pt;z-index:251659264;visibility:visible;mso-wrap-style:square;mso-width-percent:0;mso-height-percent:0;mso-wrap-distance-left:9pt;mso-wrap-distance-top:0;mso-wrap-distance-right:9pt;mso-wrap-distance-bottom:0;mso-position-horizontal:absolute;mso-position-horizontal-relative:text;mso-position-vertical:absolute;mso-position-vertical-relative:text;mso-width-percent:0;mso-height-percent:0;mso-width-relative:margin;mso-height-relative:margin;v-text-anchor:top" o:gfxdata="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" filled="f" stroked="f" strokeweight=".5pt">
+              <v:shape id="Надпись 4" o:spid="_x0000_s1026" type="#_x0000_t202" style="position:absolute;margin-left:147.9pt;margin-top:473pt;width:359.35pt;height:132.7pt;z-index:251659264;visibility:visible;mso-wrap-style:square;mso-width-percent:0;mso-height-percent:0;mso-wrap-distance-left:9pt;mso-wrap-distance-top:0;mso-wrap-distance-right:9pt;mso-wrap-distance-bottom:0;mso-position-horizontal:absolute;mso-position-horizontal-relative:text;mso-position-vertical:absolute;mso-position-vertical-relative:text;mso-width-percent:0;mso-height-percent:0;mso-width-relative:margin;mso-height-relative:margin;v-text-anchor:top" o:gfxdata="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" filled="f" stroked="f" strokeweight=".5pt">
                 <v:textbox>
                   <w:txbxContent>
                     <w:p>
@@ -303,7 +255,15 @@
                           <w:sz w:val="26"/>
                           <w:szCs w:val="26"/>
                         </w:rPr>
-                        <w:t xml:space="preserve"> Иванов Иван Иванович</w:t>
+                        <w:t xml:space="preserve"> Иванов </w:t>
+                      </w:r>
+                      <w:r>
+                        <w:rPr>
+                          <w:rFonts w:ascii="Muller Regular" w:hAnsi="Muller Regular"/>
+                          <w:sz w:val="26"/>
+                          <w:szCs w:val="26"/>
+                        </w:rPr>
+                        <w:t>Андрей Вячеславович</w:t>
                       </w:r>
                     </w:p>
                     <w:p>
@@ -332,8 +292,18 @@
                           <w:sz w:val="26"/>
                           <w:szCs w:val="26"/>
                         </w:rPr>
-                        <w:t xml:space="preserve"> ПИиКТ</w:t>
+                        <w:t xml:space="preserve"> </w:t>
                       </w:r>
+                      <w:proofErr w:type="spellStart"/>
+                      <w:r>
+                        <w:rPr>
+                          <w:rFonts w:ascii="Muller Regular" w:hAnsi="Muller Regular"/>
+                          <w:sz w:val="26"/>
+                          <w:szCs w:val="26"/>
+                        </w:rPr>
+                        <w:t>ФИТиП</w:t>
+                      </w:r>
+                      <w:proofErr w:type="spellEnd"/>
                     </w:p>
                     <w:p>
                       <w:pPr>
@@ -369,7 +339,7 @@
                           <w:sz w:val="26"/>
                           <w:szCs w:val="26"/>
                         </w:rPr>
-                        <w:t>P32202</w:t>
+                        <w:t>М3204</w:t>
                       </w:r>
                     </w:p>
                     <w:p>
@@ -418,6 +388,72 @@
       </w:r>
       <w:r>
         <w:rPr>
+          <w:noProof/>
+        </w:rPr>
+        <w:drawing>
+          <wp:anchor distT="0" distB="0" distL="114300" distR="114300" simplePos="0" relativeHeight="251660288" behindDoc="1" locked="0" layoutInCell="1" allowOverlap="1" wp14:anchorId="1A91CC75" wp14:editId="479CFB24">
+            <wp:simplePos x="0" y="0"/>
+            <wp:positionH relativeFrom="column">
+              <wp:posOffset>-1080135</wp:posOffset>
+            </wp:positionH>
+            <wp:positionV relativeFrom="paragraph">
+              <wp:posOffset>-781082</wp:posOffset>
+            </wp:positionV>
+            <wp:extent cx="7602220" cy="10751295"/>
+            <wp:effectExtent l="0" t="0" r="0" b="0"/>
+            <wp:wrapNone/>
+            <wp:docPr id="856715392" name="Рисунок 15"/>
+            <wp:cNvGraphicFramePr>
+              <a:graphicFrameLocks xmlns:a="http://schemas.openxmlformats.org/drawingml/2006/main" noChangeAspect="1"/>
+            </wp:cNvGraphicFramePr>
+            <a:graphic xmlns:a="http://schemas.openxmlformats.org/drawingml/2006/main">
+              <a:graphicData uri="http://schemas.openxmlformats.org/drawingml/2006/picture">
+                <pic:pic xmlns:pic="http://schemas.openxmlformats.org/drawingml/2006/picture">
+                  <pic:nvPicPr>
+                    <pic:cNvPr id="856715392" name="Рисунок 15"/>
+                    <pic:cNvPicPr>
+                      <a:picLocks noChangeAspect="1" noChangeArrowheads="1"/>
+                    </pic:cNvPicPr>
+                  </pic:nvPicPr>
+                  <pic:blipFill>
+                    <a:blip r:embed="rId7" cstate="print">
+                      <a:extLst>
+                        <a:ext uri="{28A0092B-C50C-407E-A947-70E740481C1C}">
+                          <a14:useLocalDpi xmlns:a14="http://schemas.microsoft.com/office/drawing/2010/main" val="0"/>
+                        </a:ext>
+                      </a:extLst>
+                    </a:blip>
+                    <a:stretch>
+                      <a:fillRect/>
+                    </a:stretch>
+                  </pic:blipFill>
+                  <pic:spPr bwMode="auto">
+                    <a:xfrm>
+                      <a:off x="0" y="0"/>
+                      <a:ext cx="7602220" cy="10751295"/>
+                    </a:xfrm>
+                    <a:prstGeom prst="rect">
+                      <a:avLst/>
+                    </a:prstGeom>
+                    <a:noFill/>
+                    <a:ln>
+                      <a:noFill/>
+                    </a:ln>
+                  </pic:spPr>
+                </pic:pic>
+              </a:graphicData>
+            </a:graphic>
+            <wp14:sizeRelH relativeFrom="margin">
+              <wp14:pctWidth>0</wp14:pctWidth>
+            </wp14:sizeRelH>
+            <wp14:sizeRelV relativeFrom="margin">
+              <wp14:pctHeight>0</wp14:pctHeight>
+            </wp14:sizeRelV>
+          </wp:anchor>
+        </w:drawing>
+      </w:r>
+      <w:r>
+        <w:rPr>
           <w:rFonts w:ascii="Times New Roman" w:eastAsia="Times New Roman" w:hAnsi="Times New Roman" w:cs="Times New Roman"/>
           <w:b/>
           <w:sz w:val="24"/>
@@ -502,7 +538,15 @@
           <w:sz w:val="24"/>
           <w:szCs w:val="24"/>
         </w:rPr>
-        <w:t>провести анализ личного вклада в сокращение процента захораниваемых отходов;</w:t>
+        <w:t xml:space="preserve">провести анализ </w:t>
+      </w:r>
+      <w:r>
+        <w:rPr>
+          <w:rFonts w:ascii="Times New Roman" w:eastAsia="Times New Roman" w:hAnsi="Times New Roman" w:cs="Times New Roman"/>
+          <w:sz w:val="24"/>
+          <w:szCs w:val="24"/>
+        </w:rPr>
+        <w:t>личного вклада в сокращение процента захораниваемых отходов;</w:t>
       </w:r>
     </w:p>
     <w:p>
@@ -598,7 +642,15 @@
           <w:sz w:val="24"/>
           <w:szCs w:val="24"/>
         </w:rPr>
-        <w:t xml:space="preserve">провести анализ востребованности предметов личного пользования и предложить меры по их оптимизации. </w:t>
+        <w:t xml:space="preserve">провести анализ востребованности предметов личного пользования и предложить меры </w:t>
+      </w:r>
+      <w:r>
+        <w:rPr>
+          <w:rFonts w:ascii="Times New Roman" w:eastAsia="Times New Roman" w:hAnsi="Times New Roman" w:cs="Times New Roman"/>
+          <w:sz w:val="24"/>
+          <w:szCs w:val="24"/>
+        </w:rPr>
+        <w:t xml:space="preserve">по их оптимизации. </w:t>
       </w:r>
     </w:p>
     <w:p>
@@ -730,7 +782,15 @@
                 <w:sz w:val="24"/>
                 <w:szCs w:val="24"/>
               </w:rPr>
-              <w:t>Какие выгоды (экономические, социальные, экологические) вы и все участники процесса смогут получить благодаря раздельному сбору на выбранном объекте</w:t>
+              <w:t xml:space="preserve">Какие выгоды (экономические, социальные, экологические) вы и все участники процесса смогут </w:t>
+            </w:r>
+            <w:r>
+              <w:rPr>
+                <w:rFonts w:ascii="Times New Roman" w:eastAsia="Times New Roman" w:hAnsi="Times New Roman" w:cs="Times New Roman"/>
+                <w:sz w:val="24"/>
+                <w:szCs w:val="24"/>
+              </w:rPr>
+              <w:t>получить благодаря раздельному сбору на выбранном объекте</w:t>
             </w:r>
           </w:p>
           <w:p>
@@ -1008,6 +1068,8 @@
               </w:rPr>
               <w:t>...</w:t>
             </w:r>
+            <w:bookmarkStart w:id="0" w:name="_GoBack"/>
+            <w:bookmarkEnd w:id="0"/>
           </w:p>
         </w:tc>
       </w:tr>
@@ -1358,6 +1420,14 @@
               </w:rPr>
               <w:t>1.</w:t>
             </w:r>
+            <w:r>
+              <w:rPr>
+                <w:rFonts w:ascii="Times New Roman" w:eastAsia="Times New Roman" w:hAnsi="Times New Roman" w:cs="Times New Roman"/>
+                <w:sz w:val="24"/>
+                <w:szCs w:val="24"/>
+              </w:rPr>
+              <w:t xml:space="preserve"> </w:t>
+            </w:r>
           </w:p>
         </w:tc>
         <w:tc>
@@ -1424,6 +1494,14 @@
               </w:rPr>
               <w:t>2.</w:t>
             </w:r>
+            <w:r>
+              <w:rPr>
+                <w:rFonts w:ascii="Times New Roman" w:eastAsia="Times New Roman" w:hAnsi="Times New Roman" w:cs="Times New Roman"/>
+                <w:sz w:val="24"/>
+                <w:szCs w:val="24"/>
+              </w:rPr>
+              <w:t xml:space="preserve"> </w:t>
+            </w:r>
           </w:p>
         </w:tc>
         <w:tc>
@@ -1489,6 +1567,14 @@
                 <w:szCs w:val="24"/>
               </w:rPr>
               <w:t>3.</w:t>
+            </w:r>
+            <w:r>
+              <w:rPr>
+                <w:rFonts w:ascii="Times New Roman" w:eastAsia="Times New Roman" w:hAnsi="Times New Roman" w:cs="Times New Roman"/>
+                <w:sz w:val="24"/>
+                <w:szCs w:val="24"/>
+              </w:rPr>
+              <w:t xml:space="preserve"> </w:t>
             </w:r>
           </w:p>
         </w:tc>
@@ -3685,7 +3771,7 @@
                     <pic:cNvPicPr preferRelativeResize="0"/>
                   </pic:nvPicPr>
                   <pic:blipFill>
-                    <a:blip r:embed="rId7"/>
+                    <a:blip r:embed="rId8"/>
                     <a:srcRect/>
                     <a:stretch>
                       <a:fillRect/>
@@ -3808,7 +3894,16 @@
                 <w:sz w:val="24"/>
                 <w:szCs w:val="24"/>
               </w:rPr>
-              <w:t>(варианты оптимизации своего гардероба)</w:t>
+              <w:t>(ва</w:t>
+            </w:r>
+            <w:r>
+              <w:rPr>
+                <w:rFonts w:ascii="Times New Roman" w:eastAsia="Times New Roman" w:hAnsi="Times New Roman" w:cs="Times New Roman"/>
+                <w:i/>
+                <w:sz w:val="24"/>
+                <w:szCs w:val="24"/>
+              </w:rPr>
+              <w:t>рианты оптимизации своего гардероба)</w:t>
             </w:r>
           </w:p>
         </w:tc>
@@ -4067,7 +4162,16 @@
                 <w:sz w:val="24"/>
                 <w:szCs w:val="24"/>
               </w:rPr>
-              <w:t>Покупаю новые ботинки, если старые уже нельзя отремонтировать у сапожника</w:t>
+              <w:t xml:space="preserve">Покупаю новые ботинки, если </w:t>
+            </w:r>
+            <w:r>
+              <w:rPr>
+                <w:rFonts w:ascii="Times New Roman" w:eastAsia="Times New Roman" w:hAnsi="Times New Roman" w:cs="Times New Roman"/>
+                <w:i/>
+                <w:sz w:val="24"/>
+                <w:szCs w:val="24"/>
+              </w:rPr>
+              <w:t>старые уже нельзя отремонтировать у сапожника</w:t>
             </w:r>
           </w:p>
           <w:p>
@@ -4193,27 +4297,7 @@
           <w:sz w:val="24"/>
           <w:szCs w:val="24"/>
         </w:rPr>
-        <w:t xml:space="preserve">Сделайте обобщенный вывод по всем выполненным заданиям. </w:t>
-      </w:r>
-      <w:proofErr w:type="gramStart"/>
-      <w:r>
-        <w:rPr>
-          <w:rFonts w:ascii="Times New Roman" w:eastAsia="Times New Roman" w:hAnsi="Times New Roman" w:cs="Times New Roman"/>
-          <w:i/>
-          <w:sz w:val="24"/>
-          <w:szCs w:val="24"/>
-        </w:rPr>
-        <w:t>Вывод это</w:t>
-      </w:r>
-      <w:proofErr w:type="gramEnd"/>
-      <w:r>
-        <w:rPr>
-          <w:rFonts w:ascii="Times New Roman" w:eastAsia="Times New Roman" w:hAnsi="Times New Roman" w:cs="Times New Roman"/>
-          <w:i/>
-          <w:sz w:val="24"/>
-          <w:szCs w:val="24"/>
-        </w:rPr>
-        <w:t xml:space="preserve"> анализ и заключение (суждение), к которому Вы пришли после проделанной работы, а не </w:t>
+        <w:t xml:space="preserve">Сделайте обобщенный вывод по всем выполненным заданиям. Вывод это анализ и заключение (суждение), к которому Вы пришли после проделанной работы, а не </w:t>
       </w:r>
       <w:proofErr w:type="gramStart"/>
       <w:r>
@@ -4247,8 +4331,8 @@
 </file>
 
 <file path=word/numbering.xml><?xml version="1.0" encoding="utf-8"?>
-<w:numbering xmlns:wpc="http://schemas.microsoft.com/office/word/2010/wordprocessingCanvas" xmlns:cx="http://schemas.microsoft.com/office/drawing/2014/chartex" xmlns:cx1="http://schemas.microsoft.com/office/drawing/2015/9/8/chartex" xmlns:cx2="http://schemas.microsoft.com/office/drawing/2015/10/21/chartex" xmlns:cx3="http://schemas.microsoft.com/office/drawing/2016/5/9/chartex" xmlns:cx4="http://schemas.microsoft.com/office/drawing/2016/5/10/chartex" xmlns:cx5="http://schemas.microsoft.com/office/drawing/2016/5/11/chartex" xmlns:cx6="http://schemas.microsoft.com/office/drawing/2016/5/12/chartex" xmlns:cx7="http://schemas.microsoft.com/office/drawing/2016/5/13/chartex" xmlns:cx8="http://schemas.microsoft.com/office/drawing/2016/5/14/chartex" xmlns:mc="http://schemas.openxmlformats.org/markup-compatibility/2006" xmlns:aink="http://schemas.microsoft.com/office/drawing/2016/ink" xmlns:am3d="http://schemas.microsoft.com/office/drawing/2017/model3d" xmlns:o="urn:schemas-microsoft-com:office:office" xmlns:oel="http://schemas.microsoft.com/office/2019/extlst" xmlns:r="http://schemas.openxmlformats.org/officeDocument/2006/relationships" xmlns:m="http://schemas.openxmlformats.org/officeDocument/2006/math" xmlns:v="urn:schemas-microsoft-com:vml" xmlns:wp14="http://schemas.microsoft.com/office/word/2010/wordprocessingDrawing" xmlns:wp="http://schemas.openxmlformats.org/drawingml/2006/wordprocessingDrawing" xmlns:w10="urn:schemas-microsoft-com:office:word" xmlns:w="http://schemas.openxmlformats.org/wordprocessingml/2006/main" xmlns:w14="http://schemas.microsoft.com/office/word/2010/wordml" xmlns:w15="http://schemas.microsoft.com/office/word/2012/wordml" xmlns:w16cex="http://schemas.microsoft.com/office/word/2018/wordml/cex" xmlns:w16cid="http://schemas.microsoft.com/office/word/2016/wordml/cid" xmlns:w16="http://schemas.microsoft.com/office/word/2018/wordml" xmlns:w16du="http://schemas.microsoft.com/office/word/2023/wordml/word16du" xmlns:w16sdtdh="http://schemas.microsoft.com/office/word/2020/wordml/sdtdatahash" xmlns:w16sdtfl="http://schemas.microsoft.com/office/word/2024/wordml/sdtformatlock" xmlns:w16se="http://schemas.microsoft.com/office/word/2015/wordml/symex" xmlns:wpg="http://schemas.microsoft.com/office/word/2010/wordprocessingGroup" xmlns:wpi="http://schemas.microsoft.com/office/word/2010/wordprocessingInk" xmlns:wne="http://schemas.microsoft.com/office/word/2006/wordml" xmlns:wps="http://schemas.microsoft.com/office/word/2010/wordprocessingShape" mc:Ignorable="w14 w15 w16se w16cid w16 w16cex w16sdtdh w16sdtfl w16du wp14">
-  <w:abstractNum w:abstractNumId="0" w15:restartNumberingAfterBreak="0">
+<w:numbering xmlns:wpc="http://schemas.microsoft.com/office/word/2010/wordprocessingCanvas" xmlns:mc="http://schemas.openxmlformats.org/markup-compatibility/2006" xmlns:o="urn:schemas-microsoft-com:office:office" xmlns:r="http://schemas.openxmlformats.org/officeDocument/2006/relationships" xmlns:m="http://schemas.openxmlformats.org/officeDocument/2006/math" xmlns:v="urn:schemas-microsoft-com:vml" xmlns:wp14="http://schemas.microsoft.com/office/word/2010/wordprocessingDrawing" xmlns:wp="http://schemas.openxmlformats.org/drawingml/2006/wordprocessingDrawing" xmlns:w10="urn:schemas-microsoft-com:office:word" xmlns:w="http://schemas.openxmlformats.org/wordprocessingml/2006/main" xmlns:w14="http://schemas.microsoft.com/office/word/2010/wordml" xmlns:w15="http://schemas.microsoft.com/office/word/2012/wordml" xmlns:wpg="http://schemas.microsoft.com/office/word/2010/wordprocessingGroup" xmlns:wpi="http://schemas.microsoft.com/office/word/2010/wordprocessingInk" xmlns:wne="http://schemas.microsoft.com/office/word/2006/wordml" xmlns:wps="http://schemas.microsoft.com/office/word/2010/wordprocessingShape" mc:Ignorable="w14 w15 wp14">
+  <w:abstractNum w:abstractNumId="0">
     <w:nsid w:val="16502DD1"/>
     <w:multiLevelType w:val="multilevel"/>
     <w:tmpl w:val="EA0EB37C"/>
@@ -4334,7 +4418,7 @@
       </w:pPr>
     </w:lvl>
   </w:abstractNum>
-  <w:abstractNum w:abstractNumId="1" w15:restartNumberingAfterBreak="0">
+  <w:abstractNum w:abstractNumId="1">
     <w:nsid w:val="42D9455A"/>
     <w:multiLevelType w:val="multilevel"/>
     <w:tmpl w:val="833ACA5A"/>
@@ -4447,7 +4531,7 @@
       </w:rPr>
     </w:lvl>
   </w:abstractNum>
-  <w:abstractNum w:abstractNumId="2" w15:restartNumberingAfterBreak="0">
+  <w:abstractNum w:abstractNumId="2">
     <w:nsid w:val="6A1D169D"/>
     <w:multiLevelType w:val="multilevel"/>
     <w:tmpl w:val="67246B80"/>
@@ -4560,20 +4644,20 @@
       </w:rPr>
     </w:lvl>
   </w:abstractNum>
-  <w:num w:numId="1" w16cid:durableId="1931237232">
+  <w:num w:numId="1">
     <w:abstractNumId w:val="2"/>
   </w:num>
-  <w:num w:numId="2" w16cid:durableId="984504128">
+  <w:num w:numId="2">
     <w:abstractNumId w:val="0"/>
   </w:num>
-  <w:num w:numId="3" w16cid:durableId="743916063">
+  <w:num w:numId="3">
     <w:abstractNumId w:val="1"/>
   </w:num>
 </w:numbering>
 </file>
 
 <file path=word/styles.xml><?xml version="1.0" encoding="utf-8"?>
-<w:styles xmlns:mc="http://schemas.openxmlformats.org/markup-compatibility/2006" xmlns:r="http://schemas.openxmlformats.org/officeDocument/2006/relationships" xmlns:w="http://schemas.openxmlformats.org/wordprocessingml/2006/main" xmlns:w14="http://schemas.microsoft.com/office/word/2010/wordml" xmlns:w15="http://schemas.microsoft.com/office/word/2012/wordml" xmlns:w16cex="http://schemas.microsoft.com/office/word/2018/wordml/cex" xmlns:w16cid="http://schemas.microsoft.com/office/word/2016/wordml/cid" xmlns:w16="http://schemas.microsoft.com/office/word/2018/wordml" xmlns:w16du="http://schemas.microsoft.com/office/word/2023/wordml/word16du" xmlns:w16sdtdh="http://schemas.microsoft.com/office/word/2020/wordml/sdtdatahash" xmlns:w16sdtfl="http://schemas.microsoft.com/office/word/2024/wordml/sdtformatlock" xmlns:w16se="http://schemas.microsoft.com/office/word/2015/wordml/symex" mc:Ignorable="w14 w15 w16se w16cid w16 w16cex w16sdtdh w16sdtfl w16du">
+<w:styles xmlns:mc="http://schemas.openxmlformats.org/markup-compatibility/2006" xmlns:r="http://schemas.openxmlformats.org/officeDocument/2006/relationships" xmlns:w="http://schemas.openxmlformats.org/wordprocessingml/2006/main" xmlns:w14="http://schemas.microsoft.com/office/word/2010/wordml" xmlns:w15="http://schemas.microsoft.com/office/word/2012/wordml" mc:Ignorable="w14 w15">
   <w:docDefaults>
     <w:rPrDefault>
       <w:rPr>
@@ -4589,7 +4673,7 @@
       </w:pPr>
     </w:pPrDefault>
   </w:docDefaults>
-  <w:latentStyles w:defLockedState="0" w:defUIPriority="99" w:defSemiHidden="0" w:defUnhideWhenUsed="0" w:defQFormat="0" w:count="376">
+  <w:latentStyles w:defLockedState="0" w:defUIPriority="99" w:defSemiHidden="0" w:defUnhideWhenUsed="0" w:defQFormat="0" w:count="371">
     <w:lsdException w:name="Normal" w:uiPriority="0" w:qFormat="1"/>
     <w:lsdException w:name="heading 1" w:uiPriority="9" w:qFormat="1"/>
     <w:lsdException w:name="heading 2" w:semiHidden="1" w:uiPriority="9" w:unhideWhenUsed="1" w:qFormat="1"/>
@@ -4961,11 +5045,6 @@
     <w:lsdException w:name="List Table 5 Dark Accent 6" w:uiPriority="50"/>
     <w:lsdException w:name="List Table 6 Colorful Accent 6" w:uiPriority="51"/>
     <w:lsdException w:name="List Table 7 Colorful Accent 6" w:uiPriority="52"/>
-    <w:lsdException w:name="Mention" w:semiHidden="1" w:unhideWhenUsed="1"/>
-    <w:lsdException w:name="Smart Hyperlink" w:semiHidden="1" w:unhideWhenUsed="1"/>
-    <w:lsdException w:name="Hashtag" w:semiHidden="1" w:unhideWhenUsed="1"/>
-    <w:lsdException w:name="Unresolved Mention" w:semiHidden="1" w:unhideWhenUsed="1"/>
-    <w:lsdException w:name="Smart Link" w:semiHidden="1" w:unhideWhenUsed="1"/>
   </w:latentStyles>
   <w:style w:type="paragraph" w:default="1" w:styleId="a">
     <w:name w:val="Normal"/>
@@ -5201,6 +5280,7 @@
       <w:spacing w:after="0" w:line="240" w:lineRule="auto"/>
     </w:pPr>
     <w:tblPr>
+      <w:tblInd w:w="0" w:type="dxa"/>
       <w:tblBorders>
         <w:top w:val="single" w:sz="4" w:space="0" w:color="auto"/>
         <w:left w:val="single" w:sz="4" w:space="0" w:color="auto"/>
@@ -5209,6 +5289,12 @@
         <w:insideH w:val="single" w:sz="4" w:space="0" w:color="auto"/>
         <w:insideV w:val="single" w:sz="4" w:space="0" w:color="auto"/>
       </w:tblBorders>
+      <w:tblCellMar>
+        <w:top w:w="0" w:type="dxa"/>
+        <w:left w:w="108" w:type="dxa"/>
+        <w:bottom w:w="0" w:type="dxa"/>
+        <w:right w:w="108" w:type="dxa"/>
+      </w:tblCellMar>
     </w:tblPr>
   </w:style>
   <w:style w:type="paragraph" w:styleId="a5">
@@ -5402,7 +5488,9 @@
       <w:tblStyleRowBandSize w:val="1"/>
       <w:tblStyleColBandSize w:val="1"/>
       <w:tblCellMar>
+        <w:top w:w="0" w:type="dxa"/>
         <w:left w:w="108" w:type="dxa"/>
+        <w:bottom w:w="0" w:type="dxa"/>
         <w:right w:w="108" w:type="dxa"/>
       </w:tblCellMar>
     </w:tblPr>
@@ -5442,7 +5530,9 @@
       <w:tblStyleRowBandSize w:val="1"/>
       <w:tblStyleColBandSize w:val="1"/>
       <w:tblCellMar>
+        <w:top w:w="0" w:type="dxa"/>
         <w:left w:w="108" w:type="dxa"/>
+        <w:bottom w:w="0" w:type="dxa"/>
         <w:right w:w="108" w:type="dxa"/>
       </w:tblCellMar>
     </w:tblPr>
@@ -5456,7 +5546,9 @@
       <w:tblStyleRowBandSize w:val="1"/>
       <w:tblStyleColBandSize w:val="1"/>
       <w:tblCellMar>
+        <w:top w:w="0" w:type="dxa"/>
         <w:left w:w="108" w:type="dxa"/>
+        <w:bottom w:w="0" w:type="dxa"/>
         <w:right w:w="108" w:type="dxa"/>
       </w:tblCellMar>
     </w:tblPr>
@@ -5470,7 +5562,9 @@
       <w:tblStyleRowBandSize w:val="1"/>
       <w:tblStyleColBandSize w:val="1"/>
       <w:tblCellMar>
+        <w:top w:w="0" w:type="dxa"/>
         <w:left w:w="108" w:type="dxa"/>
+        <w:bottom w:w="0" w:type="dxa"/>
         <w:right w:w="108" w:type="dxa"/>
       </w:tblCellMar>
     </w:tblPr>
@@ -5484,7 +5578,9 @@
       <w:tblStyleRowBandSize w:val="1"/>
       <w:tblStyleColBandSize w:val="1"/>
       <w:tblCellMar>
+        <w:top w:w="0" w:type="dxa"/>
         <w:left w:w="108" w:type="dxa"/>
+        <w:bottom w:w="0" w:type="dxa"/>
         <w:right w:w="108" w:type="dxa"/>
       </w:tblCellMar>
     </w:tblPr>
@@ -5498,7 +5594,9 @@
       <w:tblStyleRowBandSize w:val="1"/>
       <w:tblStyleColBandSize w:val="1"/>
       <w:tblCellMar>
+        <w:top w:w="0" w:type="dxa"/>
         <w:left w:w="108" w:type="dxa"/>
+        <w:bottom w:w="0" w:type="dxa"/>
         <w:right w:w="108" w:type="dxa"/>
       </w:tblCellMar>
     </w:tblPr>
@@ -5512,7 +5610,9 @@
       <w:tblStyleRowBandSize w:val="1"/>
       <w:tblStyleColBandSize w:val="1"/>
       <w:tblCellMar>
+        <w:top w:w="0" w:type="dxa"/>
         <w:left w:w="108" w:type="dxa"/>
+        <w:bottom w:w="0" w:type="dxa"/>
         <w:right w:w="108" w:type="dxa"/>
       </w:tblCellMar>
     </w:tblPr>
@@ -5526,7 +5626,9 @@
       <w:tblStyleRowBandSize w:val="1"/>
       <w:tblStyleColBandSize w:val="1"/>
       <w:tblCellMar>
+        <w:top w:w="0" w:type="dxa"/>
         <w:left w:w="108" w:type="dxa"/>
+        <w:bottom w:w="0" w:type="dxa"/>
         <w:right w:w="108" w:type="dxa"/>
       </w:tblCellMar>
     </w:tblPr>
@@ -5540,7 +5642,9 @@
       <w:tblStyleRowBandSize w:val="1"/>
       <w:tblStyleColBandSize w:val="1"/>
       <w:tblCellMar>
+        <w:top w:w="0" w:type="dxa"/>
         <w:left w:w="108" w:type="dxa"/>
+        <w:bottom w:w="0" w:type="dxa"/>
         <w:right w:w="108" w:type="dxa"/>
       </w:tblCellMar>
     </w:tblPr>
@@ -5554,7 +5658,9 @@
       <w:tblStyleRowBandSize w:val="1"/>
       <w:tblStyleColBandSize w:val="1"/>
       <w:tblCellMar>
+        <w:top w:w="0" w:type="dxa"/>
         <w:left w:w="108" w:type="dxa"/>
+        <w:bottom w:w="0" w:type="dxa"/>
         <w:right w:w="108" w:type="dxa"/>
       </w:tblCellMar>
     </w:tblPr>
@@ -6024,6 +6130,10 @@
 </go:gDocsCustomXmlDataStorage>
 </file>
 
+<file path=customXml/item2.xml><?xml version="1.0" encoding="utf-8"?>
+<b:Sources xmlns:b="http://schemas.openxmlformats.org/officeDocument/2006/bibliography" xmlns="http://schemas.openxmlformats.org/officeDocument/2006/bibliography" SelectedStyle="\APASixthEditionOfficeOnline.xsl" StyleName="APA" Version="6"/>
+</file>
+
 <file path=customXml/itemProps1.xml><?xml version="1.0" encoding="utf-8"?>
 <ds:datastoreItem xmlns:ds="http://schemas.openxmlformats.org/officeDocument/2006/customXml" ds:itemID="{11111111-1234-1234-1234-123412341234}">
   <ds:schemaRefs>
@@ -6031,4 +6141,12 @@
     <ds:schemaRef ds:uri="http://schemas.openxmlformats.org/officeDocument/2006/relationships"/>
   </ds:schemaRefs>
 </ds:datastoreItem>
+</file>
+
+<file path=customXml/itemProps2.xml><?xml version="1.0" encoding="utf-8"?>
+<ds:datastoreItem xmlns:ds="http://schemas.openxmlformats.org/officeDocument/2006/customXml" ds:itemID="{B98FD318-1395-4F1C-B907-E1000CCD0DA3}">
+  <ds:schemaRefs>
+    <ds:schemaRef ds:uri="http://schemas.openxmlformats.org/officeDocument/2006/bibliography"/>
+  </ds:schemaRefs>
+</ds:datastoreItem>
 </file>
</xml_diff>

<commit_message>
docs(y2/sem1/life-safety/lab): complete zero waste section
</commit_message>
<xml_diff>
--- a/year-2/semester-1/life-safety/labworks/conscious-consumption/labwork2-505013.docx
+++ b/year-2/semester-1/life-safety/labworks/conscious-consumption/labwork2-505013.docx
@@ -538,15 +538,7 @@
           <w:sz w:val="24"/>
           <w:szCs w:val="24"/>
         </w:rPr>
-        <w:t xml:space="preserve">провести анализ </w:t>
-      </w:r>
-      <w:r>
-        <w:rPr>
-          <w:rFonts w:ascii="Times New Roman" w:eastAsia="Times New Roman" w:hAnsi="Times New Roman" w:cs="Times New Roman"/>
-          <w:sz w:val="24"/>
-          <w:szCs w:val="24"/>
-        </w:rPr>
-        <w:t>личного вклада в сокращение процента захораниваемых отходов;</w:t>
+        <w:t>провести анализ личного вклада в сокращение процента захораниваемых отходов;</w:t>
       </w:r>
     </w:p>
     <w:p>
@@ -642,15 +634,7 @@
           <w:sz w:val="24"/>
           <w:szCs w:val="24"/>
         </w:rPr>
-        <w:t xml:space="preserve">провести анализ востребованности предметов личного пользования и предложить меры </w:t>
-      </w:r>
-      <w:r>
-        <w:rPr>
-          <w:rFonts w:ascii="Times New Roman" w:eastAsia="Times New Roman" w:hAnsi="Times New Roman" w:cs="Times New Roman"/>
-          <w:sz w:val="24"/>
-          <w:szCs w:val="24"/>
-        </w:rPr>
-        <w:t xml:space="preserve">по их оптимизации. </w:t>
+        <w:t xml:space="preserve">провести анализ востребованности предметов личного пользования и предложить меры по их оптимизации. </w:t>
       </w:r>
     </w:p>
     <w:p>
@@ -700,16 +684,41 @@
           <w:sz w:val="24"/>
           <w:szCs w:val="24"/>
         </w:rPr>
-        <w:t xml:space="preserve">Таблица 1 – Анализ возможности реализации раздельного сбора в </w:t>
+        <w:t>Таблица 1 – Анализ возможности</w:t>
       </w:r>
       <w:r>
         <w:rPr>
           <w:rFonts w:ascii="Times New Roman" w:eastAsia="Times New Roman" w:hAnsi="Times New Roman" w:cs="Times New Roman"/>
-          <w:i/>
-          <w:sz w:val="24"/>
-          <w:szCs w:val="24"/>
-        </w:rPr>
-        <w:t>“укажите адрес или объект”</w:t>
+          <w:sz w:val="24"/>
+          <w:szCs w:val="24"/>
+        </w:rPr>
+        <w:t xml:space="preserve"> реализации раздельного сбора на </w:t>
+      </w:r>
+      <w:proofErr w:type="spellStart"/>
+      <w:r>
+        <w:rPr>
+          <w:rFonts w:ascii="Times New Roman" w:eastAsia="Times New Roman" w:hAnsi="Times New Roman" w:cs="Times New Roman"/>
+          <w:sz w:val="24"/>
+          <w:szCs w:val="24"/>
+        </w:rPr>
+        <w:t>экостанция</w:t>
+      </w:r>
+      <w:proofErr w:type="spellEnd"/>
+      <w:r>
+        <w:rPr>
+          <w:rFonts w:ascii="Times New Roman" w:eastAsia="Times New Roman" w:hAnsi="Times New Roman" w:cs="Times New Roman"/>
+          <w:sz w:val="24"/>
+          <w:szCs w:val="24"/>
+        </w:rPr>
+        <w:t xml:space="preserve"> «Правила деления» на парковке ТК «МЕГА Дыбенко»</w:t>
+      </w:r>
+      <w:r>
+        <w:rPr>
+          <w:rFonts w:ascii="Times New Roman" w:eastAsia="Times New Roman" w:hAnsi="Times New Roman" w:cs="Times New Roman"/>
+          <w:sz w:val="24"/>
+          <w:szCs w:val="24"/>
+        </w:rPr>
+        <w:t xml:space="preserve">. </w:t>
       </w:r>
     </w:p>
     <w:tbl>
@@ -782,47 +791,30 @@
                 <w:sz w:val="24"/>
                 <w:szCs w:val="24"/>
               </w:rPr>
-              <w:t xml:space="preserve">Какие выгоды (экономические, социальные, экологические) вы и все участники процесса смогут </w:t>
-            </w:r>
-            <w:r>
-              <w:rPr>
-                <w:rFonts w:ascii="Times New Roman" w:eastAsia="Times New Roman" w:hAnsi="Times New Roman" w:cs="Times New Roman"/>
-                <w:sz w:val="24"/>
-                <w:szCs w:val="24"/>
-              </w:rPr>
-              <w:t>получить благодаря раздельному сбору на выбранном объекте</w:t>
-            </w:r>
-          </w:p>
-          <w:p>
-            <w:pPr>
-              <w:jc w:val="both"/>
-              <w:rPr>
-                <w:rFonts w:ascii="Times New Roman" w:eastAsia="Times New Roman" w:hAnsi="Times New Roman" w:cs="Times New Roman"/>
-                <w:i/>
-                <w:sz w:val="24"/>
-                <w:szCs w:val="24"/>
-              </w:rPr>
-            </w:pPr>
-          </w:p>
-          <w:p>
-            <w:pPr>
-              <w:jc w:val="both"/>
-              <w:rPr>
-                <w:rFonts w:ascii="Times New Roman" w:eastAsia="Times New Roman" w:hAnsi="Times New Roman" w:cs="Times New Roman"/>
-                <w:i/>
-                <w:sz w:val="24"/>
-                <w:szCs w:val="24"/>
-              </w:rPr>
-            </w:pPr>
-            <w:r>
-              <w:rPr>
-                <w:rFonts w:ascii="Times New Roman" w:eastAsia="Times New Roman" w:hAnsi="Times New Roman" w:cs="Times New Roman"/>
-                <w:i/>
-                <w:sz w:val="24"/>
-                <w:szCs w:val="24"/>
-              </w:rPr>
-              <w:t>минимум 3 пункта</w:t>
-            </w:r>
+              <w:t>Какие выгоды (экономические, социальные, экологические) вы и все участники процесса смогут получить благодаря раздельному сбору на выбранном объекте</w:t>
+            </w:r>
+          </w:p>
+          <w:p>
+            <w:pPr>
+              <w:jc w:val="both"/>
+              <w:rPr>
+                <w:rFonts w:ascii="Times New Roman" w:eastAsia="Times New Roman" w:hAnsi="Times New Roman" w:cs="Times New Roman"/>
+                <w:i/>
+                <w:sz w:val="24"/>
+                <w:szCs w:val="24"/>
+              </w:rPr>
+            </w:pPr>
+          </w:p>
+          <w:p>
+            <w:pPr>
+              <w:jc w:val="both"/>
+              <w:rPr>
+                <w:rFonts w:ascii="Times New Roman" w:eastAsia="Times New Roman" w:hAnsi="Times New Roman" w:cs="Times New Roman"/>
+                <w:i/>
+                <w:sz w:val="24"/>
+                <w:szCs w:val="24"/>
+              </w:rPr>
+            </w:pPr>
           </w:p>
         </w:tc>
         <w:tc>
@@ -846,6 +838,22 @@
               </w:rPr>
               <w:t>1.</w:t>
             </w:r>
+            <w:r>
+              <w:rPr>
+                <w:rFonts w:ascii="Times New Roman" w:eastAsia="Times New Roman" w:hAnsi="Times New Roman" w:cs="Times New Roman"/>
+                <w:sz w:val="24"/>
+                <w:szCs w:val="24"/>
+              </w:rPr>
+              <w:t xml:space="preserve"> М</w:t>
+            </w:r>
+            <w:r>
+              <w:rPr>
+                <w:rFonts w:ascii="Times New Roman" w:eastAsia="Times New Roman" w:hAnsi="Times New Roman" w:cs="Times New Roman"/>
+                <w:sz w:val="24"/>
+                <w:szCs w:val="24"/>
+              </w:rPr>
+              <w:t>ожно отдельно сдать бумагу, пластик, стекло, металл и текстиль. Эти материалы не обязательно отправлять в общий мусор.</w:t>
+            </w:r>
           </w:p>
           <w:p>
             <w:pPr>
@@ -864,6 +872,38 @@
               </w:rPr>
               <w:t>2.</w:t>
             </w:r>
+            <w:r>
+              <w:rPr>
+                <w:rFonts w:ascii="Times New Roman" w:eastAsia="Times New Roman" w:hAnsi="Times New Roman" w:cs="Times New Roman"/>
+                <w:sz w:val="24"/>
+                <w:szCs w:val="24"/>
+              </w:rPr>
+              <w:t xml:space="preserve"> </w:t>
+            </w:r>
+            <w:r>
+              <w:rPr>
+                <w:rFonts w:ascii="Times New Roman" w:eastAsia="Times New Roman" w:hAnsi="Times New Roman" w:cs="Times New Roman"/>
+                <w:sz w:val="24"/>
+                <w:szCs w:val="24"/>
+              </w:rPr>
+              <w:t xml:space="preserve">У </w:t>
+            </w:r>
+            <w:r>
+              <w:rPr>
+                <w:rFonts w:ascii="Times New Roman" w:eastAsia="Times New Roman" w:hAnsi="Times New Roman" w:cs="Times New Roman"/>
+                <w:sz w:val="24"/>
+                <w:szCs w:val="24"/>
+              </w:rPr>
+              <w:t>торгового центра</w:t>
+            </w:r>
+            <w:r>
+              <w:rPr>
+                <w:rFonts w:ascii="Times New Roman" w:eastAsia="Times New Roman" w:hAnsi="Times New Roman" w:cs="Times New Roman"/>
+                <w:sz w:val="24"/>
+                <w:szCs w:val="24"/>
+              </w:rPr>
+              <w:t xml:space="preserve"> принимают то, что я уже сдавал: учебники, тетради, одежду и пластик. Не нужно ездить в разные пункты для каждой фракции.</w:t>
+            </w:r>
           </w:p>
           <w:p>
             <w:pPr>
@@ -882,24 +922,93 @@
               </w:rPr>
               <w:t>3.</w:t>
             </w:r>
-          </w:p>
-          <w:p>
-            <w:pPr>
-              <w:jc w:val="both"/>
-              <w:rPr>
-                <w:rFonts w:ascii="Times New Roman" w:eastAsia="Times New Roman" w:hAnsi="Times New Roman" w:cs="Times New Roman"/>
-                <w:i/>
-                <w:sz w:val="24"/>
-                <w:szCs w:val="24"/>
-              </w:rPr>
-            </w:pPr>
-            <w:r>
-              <w:rPr>
-                <w:rFonts w:ascii="Times New Roman" w:eastAsia="Times New Roman" w:hAnsi="Times New Roman" w:cs="Times New Roman"/>
-                <w:sz w:val="24"/>
-                <w:szCs w:val="24"/>
-              </w:rPr>
-              <w:t>...</w:t>
+            <w:r>
+              <w:rPr>
+                <w:rFonts w:ascii="Times New Roman" w:eastAsia="Times New Roman" w:hAnsi="Times New Roman" w:cs="Times New Roman"/>
+                <w:sz w:val="24"/>
+                <w:szCs w:val="24"/>
+              </w:rPr>
+              <w:t xml:space="preserve"> </w:t>
+            </w:r>
+            <w:proofErr w:type="spellStart"/>
+            <w:r>
+              <w:rPr>
+                <w:rFonts w:ascii="Times New Roman" w:eastAsia="Times New Roman" w:hAnsi="Times New Roman" w:cs="Times New Roman"/>
+                <w:sz w:val="24"/>
+                <w:szCs w:val="24"/>
+              </w:rPr>
+              <w:t>Экостанция</w:t>
+            </w:r>
+            <w:proofErr w:type="spellEnd"/>
+            <w:r>
+              <w:rPr>
+                <w:rFonts w:ascii="Times New Roman" w:eastAsia="Times New Roman" w:hAnsi="Times New Roman" w:cs="Times New Roman"/>
+                <w:sz w:val="24"/>
+                <w:szCs w:val="24"/>
+              </w:rPr>
+              <w:t xml:space="preserve"> находится рядом с торговым центром.</w:t>
+            </w:r>
+          </w:p>
+          <w:p>
+            <w:pPr>
+              <w:jc w:val="both"/>
+              <w:rPr>
+                <w:rFonts w:ascii="Times New Roman" w:eastAsia="Times New Roman" w:hAnsi="Times New Roman" w:cs="Times New Roman"/>
+                <w:sz w:val="24"/>
+                <w:szCs w:val="24"/>
+              </w:rPr>
+            </w:pPr>
+            <w:r>
+              <w:rPr>
+                <w:rFonts w:ascii="Times New Roman" w:eastAsia="Times New Roman" w:hAnsi="Times New Roman" w:cs="Times New Roman"/>
+                <w:sz w:val="24"/>
+                <w:szCs w:val="24"/>
+              </w:rPr>
+              <w:t xml:space="preserve">4. </w:t>
+            </w:r>
+            <w:r>
+              <w:rPr>
+                <w:rFonts w:ascii="Times New Roman" w:eastAsia="Times New Roman" w:hAnsi="Times New Roman" w:cs="Times New Roman"/>
+                <w:sz w:val="24"/>
+                <w:szCs w:val="24"/>
+              </w:rPr>
+              <w:t xml:space="preserve">Контейнеры для ПЭТ стоят и в жилой части </w:t>
+            </w:r>
+            <w:proofErr w:type="spellStart"/>
+            <w:r>
+              <w:rPr>
+                <w:rFonts w:ascii="Times New Roman" w:eastAsia="Times New Roman" w:hAnsi="Times New Roman" w:cs="Times New Roman"/>
+                <w:sz w:val="24"/>
+                <w:szCs w:val="24"/>
+              </w:rPr>
+              <w:t>Кудрово</w:t>
+            </w:r>
+            <w:proofErr w:type="spellEnd"/>
+            <w:r>
+              <w:rPr>
+                <w:rFonts w:ascii="Times New Roman" w:eastAsia="Times New Roman" w:hAnsi="Times New Roman" w:cs="Times New Roman"/>
+                <w:sz w:val="24"/>
+                <w:szCs w:val="24"/>
+              </w:rPr>
+              <w:t xml:space="preserve">. Бутылки можно сдавать по пути, а не копить до поездки на </w:t>
+            </w:r>
+            <w:proofErr w:type="spellStart"/>
+            <w:r>
+              <w:rPr>
+                <w:rFonts w:ascii="Times New Roman" w:eastAsia="Times New Roman" w:hAnsi="Times New Roman" w:cs="Times New Roman"/>
+                <w:sz w:val="24"/>
+                <w:szCs w:val="24"/>
+              </w:rPr>
+              <w:t>экостанцию</w:t>
+            </w:r>
+            <w:proofErr w:type="spellEnd"/>
+            <w:r>
+              <w:rPr>
+                <w:rFonts w:ascii="Times New Roman" w:eastAsia="Times New Roman" w:hAnsi="Times New Roman" w:cs="Times New Roman"/>
+                <w:sz w:val="24"/>
+                <w:szCs w:val="24"/>
+              </w:rPr>
+              <w:t>.</w:t>
             </w:r>
           </w:p>
         </w:tc>
@@ -981,15 +1090,6 @@
                 <w:szCs w:val="24"/>
               </w:rPr>
             </w:pPr>
-            <w:r>
-              <w:rPr>
-                <w:rFonts w:ascii="Times New Roman" w:eastAsia="Times New Roman" w:hAnsi="Times New Roman" w:cs="Times New Roman"/>
-                <w:i/>
-                <w:sz w:val="24"/>
-                <w:szCs w:val="24"/>
-              </w:rPr>
-              <w:t>минимум 3 пункта</w:t>
-            </w:r>
           </w:p>
         </w:tc>
         <w:tc>
@@ -1013,6 +1113,30 @@
               </w:rPr>
               <w:t>1.</w:t>
             </w:r>
+            <w:r>
+              <w:rPr>
+                <w:rFonts w:ascii="Times New Roman" w:eastAsia="Times New Roman" w:hAnsi="Times New Roman" w:cs="Times New Roman"/>
+                <w:sz w:val="24"/>
+                <w:szCs w:val="24"/>
+              </w:rPr>
+              <w:t xml:space="preserve"> </w:t>
+            </w:r>
+            <w:r>
+              <w:rPr>
+                <w:rFonts w:ascii="Times New Roman" w:eastAsia="Times New Roman" w:hAnsi="Times New Roman" w:cs="Times New Roman"/>
+                <w:sz w:val="24"/>
+                <w:szCs w:val="24"/>
+              </w:rPr>
+              <w:t>Дома придётся держать отдельные пакеты для бумаги, ПЭТ и текстиля. Упаковку иногда нужно помыть и высушить.</w:t>
+            </w:r>
+            <w:r>
+              <w:rPr>
+                <w:rFonts w:ascii="Times New Roman" w:eastAsia="Times New Roman" w:hAnsi="Times New Roman" w:cs="Times New Roman"/>
+                <w:sz w:val="24"/>
+                <w:szCs w:val="24"/>
+              </w:rPr>
+              <w:t xml:space="preserve"> </w:t>
+            </w:r>
           </w:p>
           <w:p>
             <w:pPr>
@@ -1031,6 +1155,48 @@
               </w:rPr>
               <w:t>2.</w:t>
             </w:r>
+            <w:r>
+              <w:rPr>
+                <w:rFonts w:ascii="Times New Roman" w:eastAsia="Times New Roman" w:hAnsi="Times New Roman" w:cs="Times New Roman"/>
+                <w:sz w:val="24"/>
+                <w:szCs w:val="24"/>
+              </w:rPr>
+              <w:t xml:space="preserve"> </w:t>
+            </w:r>
+            <w:r>
+              <w:rPr>
+                <w:rFonts w:ascii="Times New Roman" w:eastAsia="Times New Roman" w:hAnsi="Times New Roman" w:cs="Times New Roman"/>
+                <w:sz w:val="24"/>
+                <w:szCs w:val="24"/>
+              </w:rPr>
+              <w:t xml:space="preserve">У каждого пункта свои правила. На </w:t>
+            </w:r>
+            <w:proofErr w:type="spellStart"/>
+            <w:r>
+              <w:rPr>
+                <w:rFonts w:ascii="Times New Roman" w:eastAsia="Times New Roman" w:hAnsi="Times New Roman" w:cs="Times New Roman"/>
+                <w:sz w:val="24"/>
+                <w:szCs w:val="24"/>
+              </w:rPr>
+              <w:t>экостанцию</w:t>
+            </w:r>
+            <w:proofErr w:type="spellEnd"/>
+            <w:r>
+              <w:rPr>
+                <w:rFonts w:ascii="Times New Roman" w:eastAsia="Times New Roman" w:hAnsi="Times New Roman" w:cs="Times New Roman"/>
+                <w:sz w:val="24"/>
+                <w:szCs w:val="24"/>
+              </w:rPr>
+              <w:t xml:space="preserve"> ПЭТ-бутылки нужно сдавать смятыми, а другой пластик - чистым, без скотча, ценников и части плёнки.</w:t>
+            </w:r>
+            <w:r>
+              <w:rPr>
+                <w:rFonts w:ascii="Times New Roman" w:eastAsia="Times New Roman" w:hAnsi="Times New Roman" w:cs="Times New Roman"/>
+                <w:sz w:val="24"/>
+                <w:szCs w:val="24"/>
+              </w:rPr>
+              <w:t xml:space="preserve"> </w:t>
+            </w:r>
           </w:p>
           <w:p>
             <w:pPr>
@@ -1049,27 +1215,30 @@
               </w:rPr>
               <w:t>3.</w:t>
             </w:r>
-          </w:p>
-          <w:p>
-            <w:pPr>
-              <w:jc w:val="both"/>
-              <w:rPr>
-                <w:rFonts w:ascii="Times New Roman" w:eastAsia="Times New Roman" w:hAnsi="Times New Roman" w:cs="Times New Roman"/>
-                <w:i/>
-                <w:sz w:val="24"/>
-                <w:szCs w:val="24"/>
-              </w:rPr>
-            </w:pPr>
-            <w:r>
-              <w:rPr>
-                <w:rFonts w:ascii="Times New Roman" w:eastAsia="Times New Roman" w:hAnsi="Times New Roman" w:cs="Times New Roman"/>
-                <w:sz w:val="24"/>
-                <w:szCs w:val="24"/>
-              </w:rPr>
-              <w:t>...</w:t>
-            </w:r>
-            <w:bookmarkStart w:id="0" w:name="_GoBack"/>
-            <w:bookmarkEnd w:id="0"/>
+            <w:r>
+              <w:rPr>
+                <w:rFonts w:ascii="Times New Roman" w:eastAsia="Times New Roman" w:hAnsi="Times New Roman" w:cs="Times New Roman"/>
+                <w:sz w:val="24"/>
+                <w:szCs w:val="24"/>
+              </w:rPr>
+              <w:t xml:space="preserve"> </w:t>
+            </w:r>
+            <w:r>
+              <w:rPr>
+                <w:rFonts w:ascii="Times New Roman" w:eastAsia="Times New Roman" w:hAnsi="Times New Roman" w:cs="Times New Roman"/>
+                <w:sz w:val="24"/>
+                <w:szCs w:val="24"/>
+              </w:rPr>
+              <w:t>В учебниках и тетрадях встречаются скобы, пластиковые обложки и ламинированные детали. Перед сдачей их стоит убрать, если пункт этого требует</w:t>
+            </w:r>
+            <w:r>
+              <w:rPr>
+                <w:rFonts w:ascii="Times New Roman" w:eastAsia="Times New Roman" w:hAnsi="Times New Roman" w:cs="Times New Roman"/>
+                <w:sz w:val="24"/>
+                <w:szCs w:val="24"/>
+              </w:rPr>
+              <w:t xml:space="preserve"> – при сдаче макулатуры в прошлый раз с этим были проблемы.</w:t>
+            </w:r>
           </w:p>
         </w:tc>
       </w:tr>
@@ -1150,15 +1319,6 @@
                 <w:szCs w:val="24"/>
               </w:rPr>
             </w:pPr>
-            <w:r>
-              <w:rPr>
-                <w:rFonts w:ascii="Times New Roman" w:eastAsia="Times New Roman" w:hAnsi="Times New Roman" w:cs="Times New Roman"/>
-                <w:i/>
-                <w:sz w:val="24"/>
-                <w:szCs w:val="24"/>
-              </w:rPr>
-              <w:t>минимум 3 пункта</w:t>
-            </w:r>
           </w:p>
         </w:tc>
         <w:tc>
@@ -1180,26 +1340,60 @@
                 <w:sz w:val="24"/>
                 <w:szCs w:val="24"/>
               </w:rPr>
+              <w:lastRenderedPageBreak/>
               <w:t>1.</w:t>
             </w:r>
-          </w:p>
-          <w:p>
-            <w:pPr>
-              <w:jc w:val="both"/>
-              <w:rPr>
-                <w:rFonts w:ascii="Times New Roman" w:eastAsia="Times New Roman" w:hAnsi="Times New Roman" w:cs="Times New Roman"/>
-                <w:sz w:val="24"/>
-                <w:szCs w:val="24"/>
-              </w:rPr>
-            </w:pPr>
-            <w:r>
-              <w:rPr>
-                <w:rFonts w:ascii="Times New Roman" w:eastAsia="Times New Roman" w:hAnsi="Times New Roman" w:cs="Times New Roman"/>
-                <w:sz w:val="24"/>
-                <w:szCs w:val="24"/>
-              </w:rPr>
+            <w:r>
+              <w:rPr>
+                <w:rFonts w:ascii="Times New Roman" w:eastAsia="Times New Roman" w:hAnsi="Times New Roman" w:cs="Times New Roman"/>
+                <w:sz w:val="24"/>
+                <w:szCs w:val="24"/>
+              </w:rPr>
+              <w:t xml:space="preserve"> </w:t>
+            </w:r>
+            <w:r>
+              <w:rPr>
+                <w:rFonts w:ascii="Times New Roman" w:eastAsia="Times New Roman" w:hAnsi="Times New Roman" w:cs="Times New Roman"/>
+                <w:sz w:val="24"/>
+                <w:szCs w:val="24"/>
+              </w:rPr>
+              <w:t>Контейнер могут переполнить или перенести, а перечень фракций - изменить.</w:t>
+            </w:r>
+          </w:p>
+          <w:p>
+            <w:pPr>
+              <w:jc w:val="both"/>
+              <w:rPr>
+                <w:rFonts w:ascii="Times New Roman" w:eastAsia="Times New Roman" w:hAnsi="Times New Roman" w:cs="Times New Roman"/>
+                <w:sz w:val="24"/>
+                <w:szCs w:val="24"/>
+              </w:rPr>
+            </w:pPr>
+            <w:r>
+              <w:rPr>
+                <w:rFonts w:ascii="Times New Roman" w:eastAsia="Times New Roman" w:hAnsi="Times New Roman" w:cs="Times New Roman"/>
+                <w:sz w:val="24"/>
+                <w:szCs w:val="24"/>
+              </w:rPr>
+              <w:lastRenderedPageBreak/>
               <w:t>2.</w:t>
             </w:r>
+            <w:r>
+              <w:rPr>
+                <w:rFonts w:ascii="Times New Roman" w:eastAsia="Times New Roman" w:hAnsi="Times New Roman" w:cs="Times New Roman"/>
+                <w:sz w:val="24"/>
+                <w:szCs w:val="24"/>
+              </w:rPr>
+              <w:t xml:space="preserve"> </w:t>
+            </w:r>
+            <w:r>
+              <w:rPr>
+                <w:rFonts w:ascii="Times New Roman" w:eastAsia="Times New Roman" w:hAnsi="Times New Roman" w:cs="Times New Roman"/>
+                <w:sz w:val="24"/>
+                <w:szCs w:val="24"/>
+              </w:rPr>
+              <w:t>Грязный пластик или пластик с неподходящими примесями не примут.</w:t>
+            </w:r>
           </w:p>
           <w:p>
             <w:pPr>
@@ -1218,24 +1412,57 @@
               </w:rPr>
               <w:t>3.</w:t>
             </w:r>
-          </w:p>
-          <w:p>
-            <w:pPr>
-              <w:jc w:val="both"/>
-              <w:rPr>
-                <w:rFonts w:ascii="Times New Roman" w:eastAsia="Times New Roman" w:hAnsi="Times New Roman" w:cs="Times New Roman"/>
-                <w:b/>
-                <w:sz w:val="24"/>
-                <w:szCs w:val="24"/>
-              </w:rPr>
-            </w:pPr>
-            <w:r>
-              <w:rPr>
-                <w:rFonts w:ascii="Times New Roman" w:eastAsia="Times New Roman" w:hAnsi="Times New Roman" w:cs="Times New Roman"/>
-                <w:sz w:val="24"/>
-                <w:szCs w:val="24"/>
-              </w:rPr>
-              <w:t>...</w:t>
+            <w:r>
+              <w:rPr>
+                <w:rFonts w:ascii="Times New Roman" w:eastAsia="Times New Roman" w:hAnsi="Times New Roman" w:cs="Times New Roman"/>
+                <w:sz w:val="24"/>
+                <w:szCs w:val="24"/>
+              </w:rPr>
+              <w:t xml:space="preserve"> </w:t>
+            </w:r>
+            <w:r>
+              <w:rPr>
+                <w:rFonts w:ascii="Times New Roman" w:eastAsia="Times New Roman" w:hAnsi="Times New Roman" w:cs="Times New Roman"/>
+                <w:sz w:val="24"/>
+                <w:szCs w:val="24"/>
+              </w:rPr>
+              <w:t>Без привычки отсортированное сырьё может долго лежать дома и в итоге попасть в общий бак.</w:t>
+            </w:r>
+          </w:p>
+          <w:p>
+            <w:pPr>
+              <w:jc w:val="both"/>
+              <w:rPr>
+                <w:rFonts w:ascii="Times New Roman" w:eastAsia="Times New Roman" w:hAnsi="Times New Roman" w:cs="Times New Roman"/>
+                <w:sz w:val="24"/>
+                <w:szCs w:val="24"/>
+              </w:rPr>
+            </w:pPr>
+            <w:r>
+              <w:rPr>
+                <w:rFonts w:ascii="Times New Roman" w:eastAsia="Times New Roman" w:hAnsi="Times New Roman" w:cs="Times New Roman"/>
+                <w:sz w:val="24"/>
+                <w:szCs w:val="24"/>
+              </w:rPr>
+              <w:t xml:space="preserve">4. Хоть </w:t>
+            </w:r>
+            <w:proofErr w:type="spellStart"/>
+            <w:r>
+              <w:rPr>
+                <w:rFonts w:ascii="Times New Roman" w:eastAsia="Times New Roman" w:hAnsi="Times New Roman" w:cs="Times New Roman"/>
+                <w:sz w:val="24"/>
+                <w:szCs w:val="24"/>
+              </w:rPr>
+              <w:t>экостанция</w:t>
+            </w:r>
+            <w:proofErr w:type="spellEnd"/>
+            <w:r>
+              <w:rPr>
+                <w:rFonts w:ascii="Times New Roman" w:eastAsia="Times New Roman" w:hAnsi="Times New Roman" w:cs="Times New Roman"/>
+                <w:sz w:val="24"/>
+                <w:szCs w:val="24"/>
+              </w:rPr>
+              <w:t xml:space="preserve"> недалеко от дома, необходимо добираться до туда на машине, так как нести пакеты придётся довольно много. </w:t>
             </w:r>
           </w:p>
         </w:tc>
@@ -1428,6 +1655,14 @@
               </w:rPr>
               <w:t xml:space="preserve"> </w:t>
             </w:r>
+            <w:r>
+              <w:rPr>
+                <w:rFonts w:ascii="Times New Roman" w:eastAsia="Times New Roman" w:hAnsi="Times New Roman" w:cs="Times New Roman"/>
+                <w:sz w:val="24"/>
+                <w:szCs w:val="24"/>
+              </w:rPr>
+              <w:t>Макулатура: учебники, тетради и другая бумага</w:t>
+            </w:r>
           </w:p>
         </w:tc>
         <w:tc>
@@ -1456,6 +1691,24 @@
                 <w:szCs w:val="24"/>
               </w:rPr>
             </w:pPr>
+            <w:proofErr w:type="spellStart"/>
+            <w:r>
+              <w:rPr>
+                <w:rFonts w:ascii="Times New Roman" w:eastAsia="Times New Roman" w:hAnsi="Times New Roman" w:cs="Times New Roman"/>
+                <w:sz w:val="24"/>
+                <w:szCs w:val="24"/>
+              </w:rPr>
+              <w:t>Экостанция</w:t>
+            </w:r>
+            <w:proofErr w:type="spellEnd"/>
+            <w:r>
+              <w:rPr>
+                <w:rFonts w:ascii="Times New Roman" w:eastAsia="Times New Roman" w:hAnsi="Times New Roman" w:cs="Times New Roman"/>
+                <w:sz w:val="24"/>
+                <w:szCs w:val="24"/>
+              </w:rPr>
+              <w:t xml:space="preserve"> «Правила деления», парковка ТК «МЕГА Дыбенко», Мурманское шоссе, 12-й км</w:t>
+            </w:r>
           </w:p>
         </w:tc>
       </w:tr>
@@ -1502,6 +1755,22 @@
               </w:rPr>
               <w:t xml:space="preserve"> </w:t>
             </w:r>
+            <w:r>
+              <w:rPr>
+                <w:rFonts w:ascii="Times New Roman" w:eastAsia="Times New Roman" w:hAnsi="Times New Roman" w:cs="Times New Roman"/>
+                <w:sz w:val="24"/>
+                <w:szCs w:val="24"/>
+              </w:rPr>
+              <w:t>Одежда</w:t>
+            </w:r>
+            <w:r>
+              <w:rPr>
+                <w:rFonts w:ascii="Times New Roman" w:eastAsia="Times New Roman" w:hAnsi="Times New Roman" w:cs="Times New Roman"/>
+                <w:sz w:val="24"/>
+                <w:szCs w:val="24"/>
+              </w:rPr>
+              <w:t xml:space="preserve"> и текстиль</w:t>
+            </w:r>
           </w:p>
         </w:tc>
         <w:tc>
@@ -1530,6 +1799,40 @@
                 <w:szCs w:val="24"/>
               </w:rPr>
             </w:pPr>
+            <w:r>
+              <w:rPr>
+                <w:rFonts w:ascii="Times New Roman" w:eastAsia="Times New Roman" w:hAnsi="Times New Roman" w:cs="Times New Roman"/>
+                <w:sz w:val="24"/>
+                <w:szCs w:val="24"/>
+              </w:rPr>
+              <w:t xml:space="preserve">Зелёные контейнеры фонда «Лепта», </w:t>
+            </w:r>
+            <w:proofErr w:type="spellStart"/>
+            <w:r>
+              <w:rPr>
+                <w:rFonts w:ascii="Times New Roman" w:eastAsia="Times New Roman" w:hAnsi="Times New Roman" w:cs="Times New Roman"/>
+                <w:sz w:val="24"/>
+                <w:szCs w:val="24"/>
+              </w:rPr>
+              <w:t>Кудрово</w:t>
+            </w:r>
+            <w:proofErr w:type="spellEnd"/>
+            <w:r>
+              <w:rPr>
+                <w:rFonts w:ascii="Times New Roman" w:eastAsia="Times New Roman" w:hAnsi="Times New Roman" w:cs="Times New Roman"/>
+                <w:sz w:val="24"/>
+                <w:szCs w:val="24"/>
+              </w:rPr>
+              <w:t>, Пражская ул., 9, у остановки</w:t>
+            </w:r>
+            <w:r>
+              <w:rPr>
+                <w:rFonts w:ascii="Times New Roman" w:eastAsia="Times New Roman" w:hAnsi="Times New Roman" w:cs="Times New Roman"/>
+                <w:sz w:val="24"/>
+                <w:szCs w:val="24"/>
+              </w:rPr>
+              <w:t xml:space="preserve"> </w:t>
+            </w:r>
           </w:p>
         </w:tc>
       </w:tr>
@@ -1576,6 +1879,14 @@
               </w:rPr>
               <w:t xml:space="preserve"> </w:t>
             </w:r>
+            <w:r>
+              <w:rPr>
+                <w:rFonts w:ascii="Times New Roman" w:eastAsia="Times New Roman" w:hAnsi="Times New Roman" w:cs="Times New Roman"/>
+                <w:sz w:val="24"/>
+                <w:szCs w:val="24"/>
+              </w:rPr>
+              <w:t>Пластик, главным образом ПЭТ-бутылки</w:t>
+            </w:r>
           </w:p>
         </w:tc>
         <w:tc>
@@ -1604,10 +1915,110 @@
                 <w:szCs w:val="24"/>
               </w:rPr>
             </w:pPr>
+            <w:r>
+              <w:rPr>
+                <w:rFonts w:ascii="Times New Roman" w:eastAsia="Times New Roman" w:hAnsi="Times New Roman" w:cs="Times New Roman"/>
+                <w:sz w:val="24"/>
+                <w:szCs w:val="24"/>
+              </w:rPr>
+              <w:t>Контейнер регионального оператор</w:t>
+            </w:r>
+            <w:r>
+              <w:rPr>
+                <w:rFonts w:ascii="Times New Roman" w:eastAsia="Times New Roman" w:hAnsi="Times New Roman" w:cs="Times New Roman"/>
+                <w:sz w:val="24"/>
+                <w:szCs w:val="24"/>
+              </w:rPr>
+              <w:t xml:space="preserve">а: </w:t>
+            </w:r>
+            <w:proofErr w:type="spellStart"/>
+            <w:r>
+              <w:rPr>
+                <w:rFonts w:ascii="Times New Roman" w:eastAsia="Times New Roman" w:hAnsi="Times New Roman" w:cs="Times New Roman"/>
+                <w:sz w:val="24"/>
+                <w:szCs w:val="24"/>
+              </w:rPr>
+              <w:t>Кудрово</w:t>
+            </w:r>
+            <w:proofErr w:type="spellEnd"/>
+            <w:r>
+              <w:rPr>
+                <w:rFonts w:ascii="Times New Roman" w:eastAsia="Times New Roman" w:hAnsi="Times New Roman" w:cs="Times New Roman"/>
+                <w:sz w:val="24"/>
+                <w:szCs w:val="24"/>
+              </w:rPr>
+              <w:t>, Европейский пр., 11,</w:t>
+            </w:r>
+            <w:r>
+              <w:rPr>
+                <w:rFonts w:ascii="Times New Roman" w:eastAsia="Times New Roman" w:hAnsi="Times New Roman" w:cs="Times New Roman"/>
+                <w:sz w:val="24"/>
+                <w:szCs w:val="24"/>
+              </w:rPr>
+              <w:t xml:space="preserve"> также </w:t>
+            </w:r>
+            <w:proofErr w:type="spellStart"/>
+            <w:r>
+              <w:rPr>
+                <w:rFonts w:ascii="Times New Roman" w:eastAsia="Times New Roman" w:hAnsi="Times New Roman" w:cs="Times New Roman"/>
+                <w:sz w:val="24"/>
+                <w:szCs w:val="24"/>
+              </w:rPr>
+              <w:t>экостанция</w:t>
+            </w:r>
+            <w:proofErr w:type="spellEnd"/>
+            <w:r>
+              <w:rPr>
+                <w:rFonts w:ascii="Times New Roman" w:eastAsia="Times New Roman" w:hAnsi="Times New Roman" w:cs="Times New Roman"/>
+                <w:sz w:val="24"/>
+                <w:szCs w:val="24"/>
+              </w:rPr>
+              <w:t xml:space="preserve"> у МЕГА</w:t>
+            </w:r>
           </w:p>
         </w:tc>
       </w:tr>
       <w:tr>
+        <w:tc>
+          <w:tcPr>
+            <w:tcW w:w="4677" w:type="dxa"/>
+            <w:tcMar>
+              <w:top w:w="100" w:type="dxa"/>
+              <w:left w:w="100" w:type="dxa"/>
+              <w:bottom w:w="100" w:type="dxa"/>
+              <w:right w:w="100" w:type="dxa"/>
+            </w:tcMar>
+          </w:tcPr>
+          <w:p>
+            <w:pPr>
+              <w:pStyle w:val="6"/>
+              <w:rPr>
+                <w:rFonts w:ascii="Times New Roman" w:eastAsia="Times New Roman" w:hAnsi="Times New Roman" w:cs="Times New Roman"/>
+                <w:b w:val="0"/>
+                <w:sz w:val="24"/>
+                <w:szCs w:val="24"/>
+              </w:rPr>
+            </w:pPr>
+            <w:r>
+              <w:rPr>
+                <w:rFonts w:ascii="Times New Roman" w:eastAsia="Times New Roman" w:hAnsi="Times New Roman" w:cs="Times New Roman"/>
+                <w:b w:val="0"/>
+                <w:sz w:val="24"/>
+                <w:szCs w:val="24"/>
+              </w:rPr>
+              <w:t xml:space="preserve">4. </w:t>
+            </w:r>
+            <w:r>
+              <w:rPr>
+                <w:rFonts w:ascii="Times New Roman" w:eastAsia="Times New Roman" w:hAnsi="Times New Roman" w:cs="Times New Roman"/>
+                <w:b w:val="0"/>
+                <w:sz w:val="24"/>
+                <w:szCs w:val="24"/>
+              </w:rPr>
+              <w:t>Стеклотара</w:t>
+            </w:r>
+          </w:p>
+        </w:tc>
         <w:tc>
           <w:tcPr>
             <w:tcW w:w="4677" w:type="dxa"/>
@@ -1640,36 +2051,52 @@
                 <w:sz w:val="24"/>
                 <w:szCs w:val="24"/>
               </w:rPr>
-              <w:t>...</w:t>
-            </w:r>
-          </w:p>
-        </w:tc>
-        <w:tc>
-          <w:tcPr>
-            <w:tcW w:w="4677" w:type="dxa"/>
-            <w:tcMar>
-              <w:top w:w="100" w:type="dxa"/>
-              <w:left w:w="100" w:type="dxa"/>
-              <w:bottom w:w="100" w:type="dxa"/>
-              <w:right w:w="100" w:type="dxa"/>
-            </w:tcMar>
-          </w:tcPr>
-          <w:p>
-            <w:pPr>
-              <w:widowControl w:val="0"/>
-              <w:pBdr>
-                <w:top w:val="nil"/>
-                <w:left w:val="nil"/>
-                <w:bottom w:val="nil"/>
-                <w:right w:val="nil"/>
-                <w:between w:val="nil"/>
-              </w:pBdr>
-              <w:rPr>
-                <w:rFonts w:ascii="Times New Roman" w:eastAsia="Times New Roman" w:hAnsi="Times New Roman" w:cs="Times New Roman"/>
-                <w:sz w:val="24"/>
-                <w:szCs w:val="24"/>
-              </w:rPr>
-            </w:pPr>
+              <w:t>Контейнер для стекла «</w:t>
+            </w:r>
+            <w:proofErr w:type="spellStart"/>
+            <w:r>
+              <w:rPr>
+                <w:rFonts w:ascii="Times New Roman" w:eastAsia="Times New Roman" w:hAnsi="Times New Roman" w:cs="Times New Roman"/>
+                <w:sz w:val="24"/>
+                <w:szCs w:val="24"/>
+              </w:rPr>
+              <w:t>ВторСтек</w:t>
+            </w:r>
+            <w:proofErr w:type="spellEnd"/>
+            <w:r>
+              <w:rPr>
+                <w:rFonts w:ascii="Times New Roman" w:eastAsia="Times New Roman" w:hAnsi="Times New Roman" w:cs="Times New Roman"/>
+                <w:sz w:val="24"/>
+                <w:szCs w:val="24"/>
+              </w:rPr>
+              <w:t>»</w:t>
+            </w:r>
+            <w:r>
+              <w:rPr>
+                <w:rFonts w:ascii="Times New Roman" w:eastAsia="Times New Roman" w:hAnsi="Times New Roman" w:cs="Times New Roman"/>
+                <w:sz w:val="24"/>
+                <w:szCs w:val="24"/>
+              </w:rPr>
+              <w:t xml:space="preserve">, </w:t>
+            </w:r>
+            <w:proofErr w:type="spellStart"/>
+            <w:r>
+              <w:rPr>
+                <w:rFonts w:ascii="Times New Roman" w:eastAsia="Times New Roman" w:hAnsi="Times New Roman" w:cs="Times New Roman"/>
+                <w:sz w:val="24"/>
+                <w:szCs w:val="24"/>
+              </w:rPr>
+              <w:t>Кудрово</w:t>
+            </w:r>
+            <w:proofErr w:type="spellEnd"/>
+            <w:r>
+              <w:rPr>
+                <w:rFonts w:ascii="Times New Roman" w:eastAsia="Times New Roman" w:hAnsi="Times New Roman" w:cs="Times New Roman"/>
+                <w:sz w:val="24"/>
+                <w:szCs w:val="24"/>
+              </w:rPr>
+              <w:t>, жилой комплекс Вена</w:t>
+            </w:r>
           </w:p>
         </w:tc>
       </w:tr>
@@ -2005,6 +2432,14 @@
                 <w:szCs w:val="24"/>
               </w:rPr>
             </w:pPr>
+            <w:r>
+              <w:rPr>
+                <w:rFonts w:ascii="Times New Roman" w:eastAsia="Times New Roman" w:hAnsi="Times New Roman" w:cs="Times New Roman"/>
+                <w:sz w:val="24"/>
+                <w:szCs w:val="24"/>
+              </w:rPr>
+              <w:t>-</w:t>
+            </w:r>
           </w:p>
           <w:p>
             <w:pPr>
@@ -2036,6 +2471,14 @@
                 <w:szCs w:val="24"/>
               </w:rPr>
             </w:pPr>
+            <w:r>
+              <w:rPr>
+                <w:rFonts w:ascii="Times New Roman" w:eastAsia="Times New Roman" w:hAnsi="Times New Roman" w:cs="Times New Roman"/>
+                <w:sz w:val="24"/>
+                <w:szCs w:val="24"/>
+              </w:rPr>
+              <w:t>Перед покупкой одежды проверять, нужна ли вещь действительно, особенно если она приобретается из-за смены стиля. Отказываться от лишних пакетов и ненужной одноразовой упаковки.</w:t>
+            </w:r>
           </w:p>
         </w:tc>
       </w:tr>
@@ -2106,6 +2549,14 @@
                 <w:szCs w:val="24"/>
               </w:rPr>
             </w:pPr>
+            <w:r>
+              <w:rPr>
+                <w:rFonts w:ascii="Times New Roman" w:eastAsia="Times New Roman" w:hAnsi="Times New Roman" w:cs="Times New Roman"/>
+                <w:sz w:val="24"/>
+                <w:szCs w:val="24"/>
+              </w:rPr>
+              <w:t>-</w:t>
+            </w:r>
           </w:p>
           <w:p>
             <w:pPr>
@@ -2137,6 +2588,14 @@
                 <w:szCs w:val="24"/>
               </w:rPr>
             </w:pPr>
+            <w:r>
+              <w:rPr>
+                <w:rFonts w:ascii="Times New Roman" w:eastAsia="Times New Roman" w:hAnsi="Times New Roman" w:cs="Times New Roman"/>
+                <w:sz w:val="24"/>
+                <w:szCs w:val="24"/>
+              </w:rPr>
+              <w:t>Реже покупать одежду спонтанно. Выбирать вещи, которые сочетаются с тем, что уже есть, и долго носятся.</w:t>
+            </w:r>
           </w:p>
         </w:tc>
       </w:tr>
@@ -2166,6 +2625,7 @@
                 <w:sz w:val="24"/>
                 <w:szCs w:val="24"/>
               </w:rPr>
+              <w:lastRenderedPageBreak/>
               <w:t xml:space="preserve">3 </w:t>
             </w:r>
             <w:proofErr w:type="spellStart"/>
@@ -2207,6 +2667,22 @@
                 <w:szCs w:val="24"/>
               </w:rPr>
             </w:pPr>
+            <w:r>
+              <w:rPr>
+                <w:rFonts w:ascii="Times New Roman" w:eastAsia="Times New Roman" w:hAnsi="Times New Roman" w:cs="Times New Roman"/>
+                <w:sz w:val="24"/>
+                <w:szCs w:val="24"/>
+              </w:rPr>
+              <w:t xml:space="preserve">Одежда, которая стала мала, не выбрасывается сразу, а </w:t>
+            </w:r>
+            <w:r>
+              <w:rPr>
+                <w:rFonts w:ascii="Times New Roman" w:eastAsia="Times New Roman" w:hAnsi="Times New Roman" w:cs="Times New Roman"/>
+                <w:sz w:val="24"/>
+                <w:szCs w:val="24"/>
+              </w:rPr>
+              <w:t>передаётся в контейнеры «Лепты»</w:t>
+            </w:r>
           </w:p>
           <w:p>
             <w:pPr>
@@ -2217,6 +2693,22 @@
                 <w:szCs w:val="24"/>
               </w:rPr>
             </w:pPr>
+            <w:r>
+              <w:rPr>
+                <w:rFonts w:ascii="Times New Roman" w:eastAsia="Times New Roman" w:hAnsi="Times New Roman" w:cs="Times New Roman"/>
+                <w:sz w:val="24"/>
+                <w:szCs w:val="24"/>
+              </w:rPr>
+              <w:t>Э</w:t>
+            </w:r>
+            <w:r>
+              <w:rPr>
+                <w:rFonts w:ascii="Times New Roman" w:eastAsia="Times New Roman" w:hAnsi="Times New Roman" w:cs="Times New Roman"/>
+                <w:sz w:val="24"/>
+                <w:szCs w:val="24"/>
+              </w:rPr>
+              <w:t>то даёт вещи шанс на повторное использование.</w:t>
+            </w:r>
           </w:p>
         </w:tc>
         <w:tc>
@@ -2238,6 +2730,14 @@
                 <w:szCs w:val="24"/>
               </w:rPr>
             </w:pPr>
+            <w:r>
+              <w:rPr>
+                <w:rFonts w:ascii="Times New Roman" w:eastAsia="Times New Roman" w:hAnsi="Times New Roman" w:cs="Times New Roman"/>
+                <w:sz w:val="24"/>
+                <w:szCs w:val="24"/>
+              </w:rPr>
+              <w:t>Разобрать редко носимые вещи: продать, отдать знакомым или сдать на благотворительность. Если одежду можно починить, сначала попробовать ремонт.</w:t>
+            </w:r>
           </w:p>
         </w:tc>
       </w:tr>
@@ -2308,16 +2808,22 @@
                 <w:szCs w:val="24"/>
               </w:rPr>
             </w:pPr>
-          </w:p>
-          <w:p>
-            <w:pPr>
-              <w:widowControl w:val="0"/>
-              <w:rPr>
-                <w:rFonts w:ascii="Times New Roman" w:eastAsia="Times New Roman" w:hAnsi="Times New Roman" w:cs="Times New Roman"/>
-                <w:sz w:val="24"/>
-                <w:szCs w:val="24"/>
-              </w:rPr>
-            </w:pPr>
+            <w:r>
+              <w:rPr>
+                <w:rFonts w:ascii="Times New Roman" w:eastAsia="Times New Roman" w:hAnsi="Times New Roman" w:cs="Times New Roman"/>
+                <w:sz w:val="24"/>
+                <w:szCs w:val="24"/>
+              </w:rPr>
+              <w:t>Макулатуру сдавал у МЕГА, одежду отно</w:t>
+            </w:r>
+            <w:r>
+              <w:rPr>
+                <w:rFonts w:ascii="Times New Roman" w:eastAsia="Times New Roman" w:hAnsi="Times New Roman" w:cs="Times New Roman"/>
+                <w:sz w:val="24"/>
+                <w:szCs w:val="24"/>
+              </w:rPr>
+              <w:t>сил в «Лепту», пластик сортирую.</w:t>
+            </w:r>
           </w:p>
         </w:tc>
         <w:tc>
@@ -2339,6 +2845,14 @@
                 <w:szCs w:val="24"/>
               </w:rPr>
             </w:pPr>
+            <w:r>
+              <w:rPr>
+                <w:rFonts w:ascii="Times New Roman" w:eastAsia="Times New Roman" w:hAnsi="Times New Roman" w:cs="Times New Roman"/>
+                <w:sz w:val="24"/>
+                <w:szCs w:val="24"/>
+              </w:rPr>
+              <w:t>Отдельно собирать ПЭТ и пластик с маркировками 2 и 4, сдавать их чистыми.</w:t>
+            </w:r>
           </w:p>
         </w:tc>
       </w:tr>
@@ -2409,6 +2923,14 @@
                 <w:szCs w:val="24"/>
               </w:rPr>
             </w:pPr>
+            <w:r>
+              <w:rPr>
+                <w:rFonts w:ascii="Times New Roman" w:eastAsia="Times New Roman" w:hAnsi="Times New Roman" w:cs="Times New Roman"/>
+                <w:sz w:val="24"/>
+                <w:szCs w:val="24"/>
+              </w:rPr>
+              <w:t>-</w:t>
+            </w:r>
           </w:p>
           <w:p>
             <w:pPr>
@@ -2440,6 +2962,24 @@
                 <w:szCs w:val="24"/>
               </w:rPr>
             </w:pPr>
+            <w:r>
+              <w:rPr>
+                <w:rFonts w:ascii="Times New Roman" w:eastAsia="Times New Roman" w:hAnsi="Times New Roman" w:cs="Times New Roman"/>
+                <w:sz w:val="24"/>
+                <w:szCs w:val="24"/>
+              </w:rPr>
+              <w:t xml:space="preserve">Компостировать растительные отходы только если появится удобный и разрешённый способ. В квартире без подходящих условий </w:t>
+            </w:r>
+            <w:r>
+              <w:rPr>
+                <w:rFonts w:ascii="Times New Roman" w:eastAsia="Times New Roman" w:hAnsi="Times New Roman" w:cs="Times New Roman"/>
+                <w:sz w:val="24"/>
+                <w:szCs w:val="24"/>
+              </w:rPr>
+              <w:t>этим лучше не заниматься.</w:t>
+            </w:r>
+            <w:bookmarkStart w:id="0" w:name="_GoBack"/>
+            <w:bookmarkEnd w:id="0"/>
           </w:p>
         </w:tc>
       </w:tr>
@@ -3708,6 +4248,7 @@
           <w:sz w:val="24"/>
           <w:szCs w:val="24"/>
         </w:rPr>
+        <w:lastRenderedPageBreak/>
         <w:t>Задание 3. Быстрая и медленная мода</w:t>
       </w:r>
     </w:p>
@@ -3894,16 +4435,7 @@
                 <w:sz w:val="24"/>
                 <w:szCs w:val="24"/>
               </w:rPr>
-              <w:t>(ва</w:t>
-            </w:r>
-            <w:r>
-              <w:rPr>
-                <w:rFonts w:ascii="Times New Roman" w:eastAsia="Times New Roman" w:hAnsi="Times New Roman" w:cs="Times New Roman"/>
-                <w:i/>
-                <w:sz w:val="24"/>
-                <w:szCs w:val="24"/>
-              </w:rPr>
-              <w:t>рианты оптимизации своего гардероба)</w:t>
+              <w:t>(варианты оптимизации своего гардероба)</w:t>
             </w:r>
           </w:p>
         </w:tc>
@@ -4162,16 +4694,7 @@
                 <w:sz w:val="24"/>
                 <w:szCs w:val="24"/>
               </w:rPr>
-              <w:t xml:space="preserve">Покупаю новые ботинки, если </w:t>
-            </w:r>
-            <w:r>
-              <w:rPr>
-                <w:rFonts w:ascii="Times New Roman" w:eastAsia="Times New Roman" w:hAnsi="Times New Roman" w:cs="Times New Roman"/>
-                <w:i/>
-                <w:sz w:val="24"/>
-                <w:szCs w:val="24"/>
-              </w:rPr>
-              <w:t>старые уже нельзя отремонтировать у сапожника</w:t>
+              <w:t>Покупаю новые ботинки, если старые уже нельзя отремонтировать у сапожника</w:t>
             </w:r>
           </w:p>
           <w:p>
@@ -5157,7 +5680,6 @@
     <w:basedOn w:val="a"/>
     <w:next w:val="a"/>
     <w:uiPriority w:val="9"/>
-    <w:semiHidden/>
     <w:unhideWhenUsed/>
     <w:qFormat/>
     <w:pPr>
@@ -6144,7 +6666,7 @@
 </file>
 
 <file path=customXml/itemProps2.xml><?xml version="1.0" encoding="utf-8"?>
-<ds:datastoreItem xmlns:ds="http://schemas.openxmlformats.org/officeDocument/2006/customXml" ds:itemID="{B98FD318-1395-4F1C-B907-E1000CCD0DA3}">
+<ds:datastoreItem xmlns:ds="http://schemas.openxmlformats.org/officeDocument/2006/customXml" ds:itemID="{B6F393FF-A9C7-493A-865E-23F1ACF20D27}">
   <ds:schemaRefs>
     <ds:schemaRef ds:uri="http://schemas.openxmlformats.org/officeDocument/2006/bibliography"/>
   </ds:schemaRefs>

</xml_diff>